<commit_message>
fix(ncr): update NCR N26436 with 3 correlated OOSs in Room 114B (OOS-261824, OOS-261861, OOS-261877), exclude Room 115 OOSs (OOS-261878, OOS-261932), include 477 sample dataset defense (>99.3% pass rate)
</commit_message>
<xml_diff>
--- a/NCR_N26436_Risk_Assessment_Addendum.docx
+++ b/NCR_N26436_Risk_Assessment_Addendum.docx
@@ -101,7 +101,7 @@
               <w:rPr>
                 <w:sz w:val="17"/>
               </w:rPr>
-              <w:t xml:space="preserve"> 26-Aug-2026</w:t>
+              <w:t xml:space="preserve"> 27-Aug-2026</w:t>
             </w:r>
           </w:p>
         </w:tc>
@@ -165,7 +165,7 @@
               <w:rPr>
                 <w:sz w:val="17"/>
               </w:rPr>
-              <w:t xml:space="preserve"> Cleanroom Suite 114 (Anteroom &amp; Buffer Room)</w:t>
+              <w:t xml:space="preserve"> Cleanroom Suite 114 (Anteroom 114A &amp; Buffer 114B)</w:t>
             </w:r>
           </w:p>
         </w:tc>
@@ -261,7 +261,7 @@
           <w:color w:val="2D3748"/>
           <w:sz w:val="18"/>
         </w:rPr>
-        <w:t>During routine supervisory review of environmental monitoring records, it was identified that routine weekly surface sampling (RODAC contact plates) and active air sampling for Cleanroom Suite 114 (Anteroom ISO 8 and Buffer Room ISO 7) were inadvertently omitted by EM analyst SMO for two consecutive weekly cycles spanning 03-Aug-2026 through 14-Aug-2026, as required by MICRO-SOP-2 (Environmental Monitoring of the Clean Room Facility). The primary root cause was determined to be analyst oversight during high-throughput operational cycles, compounded by the lack of an active end-of-week EM schedule reconciliation tracking mechanism.</w:t>
+        <w:t>During routine supervisory review of environmental monitoring records, it was identified that routine weekly surface sampling (RODAC contact plates) and active air sampling for Cleanroom Suite 114 (Anteroom 114A ISO 8 and Buffer Room 114B ISO 7) were inadvertently omitted by EM analyst SMO for two consecutive weekly cycles spanning 03-Aug-2026 through 14-Aug-2026, as required by MICRO-SOP-2 (Environmental Monitoring of the Clean Room Facility). The primary root cause was determined to be analyst oversight during high-throughput testing rotations, compounded by the lack of an active end-of-week EM schedule reconciliation tracking mechanism.</w:t>
       </w:r>
     </w:p>
     <w:p>
@@ -273,7 +273,7 @@
           <w:color w:val="2D3748"/>
           <w:sz w:val="18"/>
         </w:rPr>
-        <w:t>Because five (5) Celsis sterility testing Out-Of-Specification (OOS) investigations were initiated for sample submissions processed in Cleanroom Suite 114 during this exact timeframe, this Quality Risk Assessment was conducted to evaluate the state of environmental control, assess product impact, and provide a scientifically justified risk basis for each correlated OOS investigation.</w:t>
+        <w:t>Because three (3) Celsis sterility testing Out-Of-Specification (OOS) investigations were initiated for sample submissions processed in Room 114B during this timeframe, this Quality Risk Assessment was conducted to evaluate cleanroom control, analyze batch performance data across 477 concurrent samples, and establish defensible mitigation rationale for each correlated OOS investigation.</w:t>
       </w:r>
     </w:p>
     <w:p>
@@ -299,7 +299,7 @@
           <w:color w:val="2D3748"/>
           <w:sz w:val="18"/>
         </w:rPr>
-        <w:t>A comprehensive audit of all laboratory testing conducted in Cleanroom Suite 114 between 03-Aug-2026 and 14-Aug-2026 identified the following five (5) sterility test failure investigations:</w:t>
+        <w:t>A comprehensive audit of all laboratory testing and room allocations conducted in Cleanroom Suite 114 between 03-Aug-2026 and 14-Aug-2026 identified three (3) sterility test failure investigations in Room 114B:</w:t>
       </w:r>
     </w:p>
     <w:tbl>
@@ -392,7 +392,7 @@
                 <w:color w:val="FFFFFF"/>
                 <w:sz w:val="17"/>
               </w:rPr>
-              <w:t>Test Method</w:t>
+              <w:t>Testing Room</w:t>
             </w:r>
           </w:p>
         </w:tc>
@@ -544,9 +544,10 @@
             </w:pPr>
             <w:r>
               <w:rPr>
+                <w:b/>
                 <w:sz w:val="17"/>
               </w:rPr>
-              <w:t>Celsis Sterility</w:t>
+              <w:t>Room 114B</w:t>
             </w:r>
           </w:p>
         </w:tc>
@@ -569,7 +570,7 @@
               <w:rPr>
                 <w:sz w:val="17"/>
               </w:rPr>
-              <w:t>Boudreaux's New Drug Store (E01607)</w:t>
+              <w:t>Boudreaux's New Drug Store (E01607) - Methylcobalamin / Glycine</w:t>
             </w:r>
           </w:p>
         </w:tc>
@@ -591,6 +592,7 @@
             </w:pPr>
             <w:r>
               <w:rPr>
+                <w:b w:val="0"/>
                 <w:sz w:val="17"/>
               </w:rPr>
               <w:t>03-Aug-2026</w:t>
@@ -690,9 +692,10 @@
             </w:pPr>
             <w:r>
               <w:rPr>
+                <w:b/>
                 <w:sz w:val="17"/>
               </w:rPr>
-              <w:t>Celsis Sterility</w:t>
+              <w:t>Room 114B</w:t>
             </w:r>
           </w:p>
         </w:tc>
@@ -715,7 +718,7 @@
               <w:rPr>
                 <w:sz w:val="17"/>
               </w:rPr>
-              <w:t>Grand Avenue Pharmacy 13409 (E13409)</w:t>
+              <w:t>Grand Avenue Pharmacy 13409 (E13409) - Triamcinolone Acetonide</w:t>
             </w:r>
           </w:p>
         </w:tc>
@@ -737,6 +740,7 @@
             </w:pPr>
             <w:r>
               <w:rPr>
+                <w:b w:val="0"/>
                 <w:sz w:val="17"/>
               </w:rPr>
               <w:t>03-Aug-2026</w:t>
@@ -836,9 +840,10 @@
             </w:pPr>
             <w:r>
               <w:rPr>
+                <w:b/>
                 <w:sz w:val="17"/>
               </w:rPr>
-              <w:t>Celsis Sterility</w:t>
+              <w:t>Room 114B</w:t>
             </w:r>
           </w:p>
         </w:tc>
@@ -883,6 +888,7 @@
             </w:pPr>
             <w:r>
               <w:rPr>
+                <w:b w:val="0"/>
                 <w:sz w:val="17"/>
               </w:rPr>
               <w:t>06-Aug-2026</w:t>
@@ -913,303 +919,19 @@
           </w:p>
         </w:tc>
       </w:tr>
-      <w:tr>
-        <w:tc>
-          <w:tcPr>
-            <w:tcW w:type="dxa" w:w="1680"/>
-            <w:shd w:fill="F7FAFC"/>
-            <w:tcBorders>
-              <w:top w:val="single" w:sz="4" w:space="0" w:color="CBD5E0"/>
-              <w:bottom w:val="single" w:sz="4" w:space="0" w:color="CBD5E0"/>
-              <w:left w:val="single" w:sz="4" w:space="0" w:color="CBD5E0"/>
-              <w:right w:val="single" w:sz="4" w:space="0" w:color="CBD5E0"/>
-            </w:tcBorders>
-          </w:tcPr>
-          <w:p>
-            <w:pPr>
-              <w:spacing w:before="50" w:after="50"/>
-            </w:pPr>
-            <w:r>
-              <w:rPr>
-                <w:b/>
-                <w:color w:val="1A365D"/>
-                <w:sz w:val="17"/>
-              </w:rPr>
-              <w:t>ETX-260807-0243</w:t>
-            </w:r>
-          </w:p>
-        </w:tc>
-        <w:tc>
-          <w:tcPr>
-            <w:tcW w:type="dxa" w:w="1680"/>
-            <w:shd w:fill="F7FAFC"/>
-            <w:tcBorders>
-              <w:top w:val="single" w:sz="4" w:space="0" w:color="CBD5E0"/>
-              <w:bottom w:val="single" w:sz="4" w:space="0" w:color="CBD5E0"/>
-              <w:left w:val="single" w:sz="4" w:space="0" w:color="CBD5E0"/>
-              <w:right w:val="single" w:sz="4" w:space="0" w:color="CBD5E0"/>
-            </w:tcBorders>
-          </w:tcPr>
-          <w:p>
-            <w:pPr>
-              <w:spacing w:before="50" w:after="50"/>
-            </w:pPr>
-            <w:r>
-              <w:rPr>
-                <w:b/>
-                <w:color w:val="1A365D"/>
-                <w:sz w:val="17"/>
-              </w:rPr>
-              <w:t>OOS-261878</w:t>
-            </w:r>
-          </w:p>
-        </w:tc>
-        <w:tc>
-          <w:tcPr>
-            <w:tcW w:type="dxa" w:w="1680"/>
-            <w:shd w:fill="F7FAFC"/>
-            <w:tcBorders>
-              <w:top w:val="single" w:sz="4" w:space="0" w:color="CBD5E0"/>
-              <w:bottom w:val="single" w:sz="4" w:space="0" w:color="CBD5E0"/>
-              <w:left w:val="single" w:sz="4" w:space="0" w:color="CBD5E0"/>
-              <w:right w:val="single" w:sz="4" w:space="0" w:color="CBD5E0"/>
-            </w:tcBorders>
-          </w:tcPr>
-          <w:p>
-            <w:pPr>
-              <w:spacing w:before="50" w:after="50"/>
-              <w:jc w:val="center"/>
-            </w:pPr>
-            <w:r>
-              <w:rPr>
-                <w:sz w:val="17"/>
-              </w:rPr>
-              <w:t>Celsis Sterility</w:t>
-            </w:r>
-          </w:p>
-        </w:tc>
-        <w:tc>
-          <w:tcPr>
-            <w:tcW w:type="dxa" w:w="1680"/>
-            <w:shd w:fill="F7FAFC"/>
-            <w:tcBorders>
-              <w:top w:val="single" w:sz="4" w:space="0" w:color="CBD5E0"/>
-              <w:bottom w:val="single" w:sz="4" w:space="0" w:color="CBD5E0"/>
-              <w:left w:val="single" w:sz="4" w:space="0" w:color="CBD5E0"/>
-              <w:right w:val="single" w:sz="4" w:space="0" w:color="CBD5E0"/>
-            </w:tcBorders>
-          </w:tcPr>
-          <w:p>
-            <w:pPr>
-              <w:spacing w:before="50" w:after="50"/>
-            </w:pPr>
-            <w:r>
-              <w:rPr>
-                <w:sz w:val="17"/>
-              </w:rPr>
-              <w:t>Celsis Sterility Batch (Hold as of 17Aug26)</w:t>
-            </w:r>
-          </w:p>
-        </w:tc>
-        <w:tc>
-          <w:tcPr>
-            <w:tcW w:type="dxa" w:w="1680"/>
-            <w:shd w:fill="F7FAFC"/>
-            <w:tcBorders>
-              <w:top w:val="single" w:sz="4" w:space="0" w:color="CBD5E0"/>
-              <w:bottom w:val="single" w:sz="4" w:space="0" w:color="CBD5E0"/>
-              <w:left w:val="single" w:sz="4" w:space="0" w:color="CBD5E0"/>
-              <w:right w:val="single" w:sz="4" w:space="0" w:color="CBD5E0"/>
-            </w:tcBorders>
-          </w:tcPr>
-          <w:p>
-            <w:pPr>
-              <w:spacing w:before="50" w:after="50"/>
-              <w:jc w:val="center"/>
-            </w:pPr>
-            <w:r>
-              <w:rPr>
-                <w:sz w:val="17"/>
-              </w:rPr>
-              <w:t>07-Aug-2026</w:t>
-            </w:r>
-          </w:p>
-        </w:tc>
-        <w:tc>
-          <w:tcPr>
-            <w:tcW w:type="dxa" w:w="1680"/>
-            <w:shd w:fill="F7FAFC"/>
-            <w:tcBorders>
-              <w:top w:val="single" w:sz="4" w:space="0" w:color="CBD5E0"/>
-              <w:bottom w:val="single" w:sz="4" w:space="0" w:color="CBD5E0"/>
-              <w:left w:val="single" w:sz="4" w:space="0" w:color="CBD5E0"/>
-              <w:right w:val="single" w:sz="4" w:space="0" w:color="CBD5E0"/>
-            </w:tcBorders>
-          </w:tcPr>
-          <w:p>
-            <w:pPr>
-              <w:spacing w:before="50" w:after="50"/>
-            </w:pPr>
-            <w:r>
-              <w:rPr>
-                <w:sz w:val="17"/>
-              </w:rPr>
-              <w:t>Phase I Lab Investigation in progress</w:t>
-            </w:r>
-          </w:p>
-        </w:tc>
-      </w:tr>
-      <w:tr>
-        <w:tc>
-          <w:tcPr>
-            <w:tcW w:type="dxa" w:w="1680"/>
-            <w:shd w:fill="FFFFFF"/>
-            <w:tcBorders>
-              <w:top w:val="single" w:sz="4" w:space="0" w:color="CBD5E0"/>
-              <w:bottom w:val="single" w:sz="4" w:space="0" w:color="CBD5E0"/>
-              <w:left w:val="single" w:sz="4" w:space="0" w:color="CBD5E0"/>
-              <w:right w:val="single" w:sz="4" w:space="0" w:color="CBD5E0"/>
-            </w:tcBorders>
-          </w:tcPr>
-          <w:p>
-            <w:pPr>
-              <w:spacing w:before="50" w:after="50"/>
-            </w:pPr>
-            <w:r>
-              <w:rPr>
-                <w:b/>
-                <w:color w:val="1A365D"/>
-                <w:sz w:val="17"/>
-              </w:rPr>
-              <w:t>ETX-260812-0342</w:t>
-            </w:r>
-          </w:p>
-        </w:tc>
-        <w:tc>
-          <w:tcPr>
-            <w:tcW w:type="dxa" w:w="1680"/>
-            <w:shd w:fill="FFFFFF"/>
-            <w:tcBorders>
-              <w:top w:val="single" w:sz="4" w:space="0" w:color="CBD5E0"/>
-              <w:bottom w:val="single" w:sz="4" w:space="0" w:color="CBD5E0"/>
-              <w:left w:val="single" w:sz="4" w:space="0" w:color="CBD5E0"/>
-              <w:right w:val="single" w:sz="4" w:space="0" w:color="CBD5E0"/>
-            </w:tcBorders>
-          </w:tcPr>
-          <w:p>
-            <w:pPr>
-              <w:spacing w:before="50" w:after="50"/>
-            </w:pPr>
-            <w:r>
-              <w:rPr>
-                <w:b/>
-                <w:color w:val="1A365D"/>
-                <w:sz w:val="17"/>
-              </w:rPr>
-              <w:t>OOS-261932</w:t>
-            </w:r>
-          </w:p>
-        </w:tc>
-        <w:tc>
-          <w:tcPr>
-            <w:tcW w:type="dxa" w:w="1680"/>
-            <w:shd w:fill="FFFFFF"/>
-            <w:tcBorders>
-              <w:top w:val="single" w:sz="4" w:space="0" w:color="CBD5E0"/>
-              <w:bottom w:val="single" w:sz="4" w:space="0" w:color="CBD5E0"/>
-              <w:left w:val="single" w:sz="4" w:space="0" w:color="CBD5E0"/>
-              <w:right w:val="single" w:sz="4" w:space="0" w:color="CBD5E0"/>
-            </w:tcBorders>
-          </w:tcPr>
-          <w:p>
-            <w:pPr>
-              <w:spacing w:before="50" w:after="50"/>
-              <w:jc w:val="center"/>
-            </w:pPr>
-            <w:r>
-              <w:rPr>
-                <w:sz w:val="17"/>
-              </w:rPr>
-              <w:t>Celsis Sterility</w:t>
-            </w:r>
-          </w:p>
-        </w:tc>
-        <w:tc>
-          <w:tcPr>
-            <w:tcW w:type="dxa" w:w="1680"/>
-            <w:shd w:fill="FFFFFF"/>
-            <w:tcBorders>
-              <w:top w:val="single" w:sz="4" w:space="0" w:color="CBD5E0"/>
-              <w:bottom w:val="single" w:sz="4" w:space="0" w:color="CBD5E0"/>
-              <w:left w:val="single" w:sz="4" w:space="0" w:color="CBD5E0"/>
-              <w:right w:val="single" w:sz="4" w:space="0" w:color="CBD5E0"/>
-            </w:tcBorders>
-          </w:tcPr>
-          <w:p>
-            <w:pPr>
-              <w:spacing w:before="50" w:after="50"/>
-            </w:pPr>
-            <w:r>
-              <w:rPr>
-                <w:sz w:val="17"/>
-              </w:rPr>
-              <w:t>Celsis Sterility Batch Submission</w:t>
-            </w:r>
-          </w:p>
-        </w:tc>
-        <w:tc>
-          <w:tcPr>
-            <w:tcW w:type="dxa" w:w="1680"/>
-            <w:shd w:fill="FFFFFF"/>
-            <w:tcBorders>
-              <w:top w:val="single" w:sz="4" w:space="0" w:color="CBD5E0"/>
-              <w:bottom w:val="single" w:sz="4" w:space="0" w:color="CBD5E0"/>
-              <w:left w:val="single" w:sz="4" w:space="0" w:color="CBD5E0"/>
-              <w:right w:val="single" w:sz="4" w:space="0" w:color="CBD5E0"/>
-            </w:tcBorders>
-          </w:tcPr>
-          <w:p>
-            <w:pPr>
-              <w:spacing w:before="50" w:after="50"/>
-              <w:jc w:val="center"/>
-            </w:pPr>
-            <w:r>
-              <w:rPr>
-                <w:sz w:val="17"/>
-              </w:rPr>
-              <w:t>12-Aug-2026</w:t>
-            </w:r>
-          </w:p>
-        </w:tc>
-        <w:tc>
-          <w:tcPr>
-            <w:tcW w:type="dxa" w:w="1680"/>
-            <w:shd w:fill="FFFFFF"/>
-            <w:tcBorders>
-              <w:top w:val="single" w:sz="4" w:space="0" w:color="CBD5E0"/>
-              <w:bottom w:val="single" w:sz="4" w:space="0" w:color="CBD5E0"/>
-              <w:left w:val="single" w:sz="4" w:space="0" w:color="CBD5E0"/>
-              <w:right w:val="single" w:sz="4" w:space="0" w:color="CBD5E0"/>
-            </w:tcBorders>
-          </w:tcPr>
-          <w:p>
-            <w:pPr>
-              <w:spacing w:before="50" w:after="50"/>
-            </w:pPr>
-            <w:r>
-              <w:rPr>
-                <w:sz w:val="17"/>
-              </w:rPr>
-              <w:t>Phase I Lab Investigation initiated</w:t>
-            </w:r>
-          </w:p>
-        </w:tc>
-      </w:tr>
     </w:tbl>
     <w:p>
       <w:pPr>
-        <w:spacing w:after="80"/>
+        <w:spacing w:before="60" w:after="80"/>
       </w:pPr>
+      <w:r>
+        <w:rPr>
+          <w:i/>
+          <w:color w:val="718096"/>
+          <w:sz w:val="16"/>
+        </w:rPr>
+        <w:t>Note on Excluded Records: Formal room allocation reconciliation confirmed that OOS-261878 and OOS-261932 were executed in Cleanroom Suite 115 (not Suite 114) and are unaffected by this nonconformance and excluded from this evaluation.</w:t>
+      </w:r>
     </w:p>
     <w:p>
       <w:pPr>
@@ -1234,7 +956,7 @@
           <w:color w:val="2D3748"/>
           <w:sz w:val="18"/>
         </w:rPr>
-        <w:t>To evaluate whether the lack of weekly background EM data indicates a breakdown in environmental control capable of contaminating product containers during testing, a multi-barrier defense evaluation was conducted across six key operational dimensions:</w:t>
+        <w:t>To evaluate whether the lack of weekly background EM data in Cleanroom Suite 114 contributed to these three (3) sterility failures, a multi-barrier defense evaluation was conducted:</w:t>
       </w:r>
     </w:p>
     <w:p>
@@ -1248,7 +970,7 @@
           <w:color w:val="2B6CB0"/>
           <w:sz w:val="20"/>
         </w:rPr>
-        <w:t>3.1 Primary Engineering Controls (PEC / ISO 5 BSC) &amp; Session In-Process Monitoring</w:t>
+        <w:t>3.1 Comprehensive Concurrent Batch Performance &amp; Statistical Negative Rate</w:t>
       </w:r>
     </w:p>
     <w:p>
@@ -1260,7 +982,45 @@
           <w:color w:val="2D3748"/>
           <w:sz w:val="18"/>
         </w:rPr>
-        <w:t>• Critical Zone Isolation: All critical aseptic testing operations (container opening, membrane filtration, fluid transfers) were conducted strictly within certified ISO Class 5 Biological Safety Cabinets (BSCs) located inside Cleanroom Suite 114. Unidirectional vertical HEPA laminar airflow provided continuous physical shielding against room air.</w:t>
+        <w:t>• 477 Concurrent Samples Audited: Retrospective audit of all laboratory submissions processed inside Cleanroom Suite 114 across the two-week window (03-Aug-2026 to 14-Aug-2026) identified 477 total samples.</w:t>
+      </w:r>
+    </w:p>
+    <w:p>
+      <w:pPr>
+        <w:spacing w:before="0" w:after="60" w:line="276" w:lineRule="auto"/>
+      </w:pPr>
+      <w:r>
+        <w:rPr>
+          <w:color w:val="2D3748"/>
+          <w:sz w:val="18"/>
+        </w:rPr>
+        <w:t>• &gt;99.3% Pass Rate / No Widespread Trend: 474 out of 477 samples successfully passed all sterility acceptance criteria with zero microbial detection. The emergence of only three (3) isolated failures confirms that no widespread, airborne, or systemic bioburden contamination existed in Cleanroom Suite 114 or Room 114B.</w:t>
+      </w:r>
+    </w:p>
+    <w:p>
+      <w:pPr>
+        <w:keepNext/>
+        <w:spacing w:before="120" w:after="60"/>
+      </w:pPr>
+      <w:r>
+        <w:rPr>
+          <w:b/>
+          <w:color w:val="2B6CB0"/>
+          <w:sz w:val="20"/>
+        </w:rPr>
+        <w:t>3.2 Primary Engineering Controls (PEC / ISO 5 BSC) &amp; Session In-Process Monitoring</w:t>
+      </w:r>
+    </w:p>
+    <w:p>
+      <w:pPr>
+        <w:spacing w:before="0" w:after="60" w:line="276" w:lineRule="auto"/>
+      </w:pPr>
+      <w:r>
+        <w:rPr>
+          <w:color w:val="2D3748"/>
+          <w:sz w:val="18"/>
+        </w:rPr>
+        <w:t>• Critical Zone Isolation: All critical aseptic testing operations (container opening, membrane filtration, fluid transfers) were conducted strictly within certified ISO Class 5 Biological Safety Cabinets (BSCs) located inside Room 114B. Unidirectional vertical HEPA laminar airflow provided continuous physical shielding against room air.</w:t>
       </w:r>
     </w:p>
     <w:p>
@@ -1325,7 +1085,7 @@
           <w:color w:val="2B6CB0"/>
           <w:sz w:val="20"/>
         </w:rPr>
-        <w:t>3.2 Continuous Automated Environmental Monitoring (Lighthouse System)</w:t>
+        <w:t>3.3 Continuous Automated Environmental Monitoring (Lighthouse System)</w:t>
       </w:r>
     </w:p>
     <w:p>
@@ -1349,33 +1109,7 @@
           <w:color w:val="2D3748"/>
           <w:sz w:val="18"/>
         </w:rPr>
-        <w:t>• Zero Physical Excursions: Retrospective review of continuous Lighthouse records spanning 03-Aug-2026 through 14-Aug-2026 confirmed:</w:t>
-      </w:r>
-    </w:p>
-    <w:p>
-      <w:pPr>
-        <w:spacing w:before="0" w:after="60" w:line="276" w:lineRule="auto"/>
-        <w:ind w:left="360"/>
-      </w:pPr>
-      <w:r>
-        <w:rPr>
-          <w:color w:val="2D3748"/>
-          <w:sz w:val="18"/>
-        </w:rPr>
-        <w:t xml:space="preserve">   - Differential Pressure Cascades: Continuous positive pressure cascades (ISO 5 -&gt; ISO 7 Buffer Room -&gt; ISO 8 Anteroom -&gt; General Lab) were maintained without pressure reversals or cascade disruptions.</w:t>
-      </w:r>
-    </w:p>
-    <w:p>
-      <w:pPr>
-        <w:spacing w:before="0" w:after="60" w:line="276" w:lineRule="auto"/>
-        <w:ind w:left="360"/>
-      </w:pPr>
-      <w:r>
-        <w:rPr>
-          <w:color w:val="2D3748"/>
-          <w:sz w:val="18"/>
-        </w:rPr>
-        <w:t xml:space="preserve">   - Temperature &amp; Humidity: Maintained strictly within validated parameters (66°F–72°F / 30%–60% RH) with no HVAC shutdowns or environmental excursions.</w:t>
+        <w:t>• Zero Physical Excursions: Retrospective review of continuous Lighthouse records confirmed continuous positive pressure cascades (ISO 5 -&gt; ISO 7 Buffer Room 114B -&gt; ISO 8 Anteroom 114A -&gt; General Lab) and tight temperature/humidity control (66°F–72°F / 30%–60% RH) with no HVAC shutdowns or pressure reversals.</w:t>
       </w:r>
     </w:p>
     <w:p>
@@ -1389,7 +1123,7 @@
           <w:color w:val="2B6CB0"/>
           <w:sz w:val="20"/>
         </w:rPr>
-        <w:t>3.3 Facility Cleaning, Disinfection, and Material Transfer Regimen</w:t>
+        <w:t>3.4 Facility Cleaning, Disinfection, and Material Transfer Regimen</w:t>
       </w:r>
     </w:p>
     <w:p>
@@ -1427,7 +1161,7 @@
           <w:color w:val="2B6CB0"/>
           <w:sz w:val="20"/>
         </w:rPr>
-        <w:t>3.4 Method Controls &amp; Concurrent Batch Performance</w:t>
+        <w:t>3.5 Method Controls &amp; Concurrent Batch Performance</w:t>
       </w:r>
     </w:p>
     <w:p>
@@ -1444,18 +1178,6 @@
     </w:p>
     <w:p>
       <w:pPr>
-        <w:spacing w:before="0" w:after="60" w:line="276" w:lineRule="auto"/>
-      </w:pPr>
-      <w:r>
-        <w:rPr>
-          <w:color w:val="2D3748"/>
-          <w:sz w:val="18"/>
-        </w:rPr>
-        <w:t>• Concurrent Batches: Multiple client batches tested in Cleanroom Suite 114 during the same timeframe met all sterility acceptance criteria, confirming the absence of uncontained airborne contamination.</w:t>
-      </w:r>
-    </w:p>
-    <w:p>
-      <w:pPr>
         <w:keepNext/>
         <w:spacing w:before="120" w:after="60"/>
       </w:pPr>
@@ -1465,7 +1187,7 @@
           <w:color w:val="2B6CB0"/>
           <w:sz w:val="20"/>
         </w:rPr>
-        <w:t>3.5 Specific Impact Evaluation &amp; Data Gap Mitigation for Correlated OOSs</w:t>
+        <w:t>3.6 Specific Impact Evaluation &amp; Data Gap Mitigation for Correlated OOSs</w:t>
       </w:r>
     </w:p>
     <w:p>
@@ -1477,7 +1199,7 @@
           <w:color w:val="2D3748"/>
           <w:sz w:val="18"/>
         </w:rPr>
-        <w:t>• Data Gap Mitigation: Although background weekly ISO 7/8 EM data were missing for these two weeks, each of the five (5) OOS investigations is being substantiated via Microbial Identification (Micro ID). Recovered isolates are cross-referenced against historical cleanroom flora libraries. Isolates distinct from environmental or skin commensals provide direct evidence of non-laboratory origin.</w:t>
+        <w:t>• Data Gap Mitigation: For the three (3) OOS cases in Room 114B (OOS-261824, OOS-261861, OOS-261877), recovered microbial isolates are being identified to genus/species to cross-reference against cleanroom flora libraries. Isolates distinct from cleanroom or skin commensals provide direct evidence of non-laboratory origin.</w:t>
       </w:r>
     </w:p>
     <w:p>
@@ -1503,7 +1225,7 @@
           <w:color w:val="2B6CB0"/>
           <w:sz w:val="20"/>
         </w:rPr>
-        <w:t>3.6 Post-Event Reinstatement &amp; Trend Verification</w:t>
+        <w:t>3.7 Post-Event Reinstatement &amp; Trend Verification</w:t>
       </w:r>
     </w:p>
     <w:p>
@@ -1856,7 +1578,7 @@
               <w:rPr>
                 <w:sz w:val="17"/>
               </w:rPr>
-              <w:t>&gt;2 to &lt;10 Process/Material/Equipment Affected (5 correlated sterility OOS investigations under review).</w:t>
+              <w:t>&gt;2 to &lt;10 Process/Material/Equipment Affected (3 correlated sterility OOS investigations in Room 114B under review).</w:t>
             </w:r>
           </w:p>
         </w:tc>
@@ -2104,7 +1826,7 @@
           <w:color w:val="2D3748"/>
           <w:sz w:val="18"/>
         </w:rPr>
-        <w:t>Based on the totality of evidence—including uninterrupted 24/7 Lighthouse physical parameter stability, satisfactory session-specific ISO 5 BSC settling and contact plate monitoring, acceptable analyst glove touch plates, valid method negative controls, and clean post-reinstatement EM results—the microbiological integrity and physical containment of Cleanroom Suite 114 remained in a validated state of control during 03-Aug-2026 through 14-Aug-2026. The missed weekly sampling represents an isolated documentation and scheduling oversight without evidence of environmental breakdown. The five (5) correlated sterility OOS investigations remain valid, and each report shall cross-reference NCR# N26436 and incorporate this risk evaluation to support Phase I closure.</w:t>
+        <w:t>Based on the totality of evidence—including 474 passing concurrent samples (&gt;99.3% pass rate), uninterrupted 24/7 Lighthouse physical parameter stability, satisfactory session-specific ISO 5 BSC settling and contact plate monitoring, acceptable analyst glove touch plates, valid method negative controls, and clean post-reinstatement EM results—the microbiological integrity and physical containment of Cleanroom Suite 114 (114A/114B) remained in a validated state of control during 03-Aug-2026 through 14-Aug-2026. The missed weekly sampling represents an isolated documentation and scheduling oversight without evidence of environmental breakdown. The three (3) correlated sterility OOS investigations in Room 114B remain valid, and each report shall cross-reference NCR# N26436 and incorporate this risk evaluation to support Phase I closure.</w:t>
       </w:r>
     </w:p>
     <w:p>
@@ -2225,7 +1947,7 @@
               <w:br/>
               <w:t>Project Microbiologist</w:t>
               <w:br/>
-              <w:t>Date: 26-Aug-2026</w:t>
+              <w:t>Date: 27-Aug-2026</w:t>
             </w:r>
           </w:p>
         </w:tc>

</xml_diff>

<commit_message>
fix(ncr): update missed weekly monitoring cycle dates from 02-Aug-2026 through 15-Aug-2026 (Sunday-to-Saturday weekly cycle definition)
</commit_message>
<xml_diff>
--- a/NCR_N26436_Risk_Assessment_Addendum.docx
+++ b/NCR_N26436_Risk_Assessment_Addendum.docx
@@ -196,7 +196,7 @@
               <w:rPr>
                 <w:sz w:val="17"/>
               </w:rPr>
-              <w:t xml:space="preserve"> 03-Aug-2026 to 14-Aug-2026 (2 Weeks)</w:t>
+              <w:t xml:space="preserve"> 02-Aug-2026 to 15-Aug-2026 (2 Weeks)</w:t>
             </w:r>
           </w:p>
         </w:tc>
@@ -261,7 +261,7 @@
           <w:color w:val="2D3748"/>
           <w:sz w:val="18"/>
         </w:rPr>
-        <w:t>During routine supervisory review of environmental monitoring records, it was identified that routine weekly surface sampling (RODAC contact plates) and active air sampling for Cleanroom Suite 114 (Anteroom 114A ISO 8 and Buffer Room 114B ISO 7) were inadvertently omitted by EM analyst SMO for two consecutive weekly cycles spanning 03-Aug-2026 through 14-Aug-2026, as required by MICRO-SOP-2 (Environmental Monitoring of the Clean Room Facility). The primary root cause was determined to be analyst oversight during high-throughput testing rotations, compounded by the lack of an active end-of-week EM schedule reconciliation tracking mechanism.</w:t>
+        <w:t>During routine supervisory review of environmental monitoring records, it was identified that routine weekly surface sampling (RODAC contact plates) and active air sampling for Cleanroom Suite 114 (Anteroom 114A ISO 8 and Buffer Room 114B ISO 7) were inadvertently omitted by EM analyst SMO for two consecutive weekly cycles spanning 02-Aug-2026 through 15-Aug-2026, as required by MICRO-SOP-2 (Environmental Monitoring of the Clean Room Facility). The primary root cause was determined to be analyst oversight during high-throughput testing rotations, compounded by the lack of an active end-of-week EM schedule reconciliation tracking mechanism.</w:t>
       </w:r>
     </w:p>
     <w:p>
@@ -299,7 +299,7 @@
           <w:color w:val="2D3748"/>
           <w:sz w:val="18"/>
         </w:rPr>
-        <w:t>A comprehensive audit of all laboratory testing and room allocations conducted in Cleanroom Suite 114 between 03-Aug-2026 and 14-Aug-2026 identified three (3) sterility test failure investigations in Room 114B:</w:t>
+        <w:t>A comprehensive audit of all laboratory testing and room allocations conducted in Cleanroom Suite 114 between 02-Aug-2026 and 15-Aug-2026 identified three (3) sterility test failure investigations in Room 114B:</w:t>
       </w:r>
     </w:p>
     <w:tbl>
@@ -982,7 +982,7 @@
           <w:color w:val="2D3748"/>
           <w:sz w:val="18"/>
         </w:rPr>
-        <w:t>• 477 Concurrent Samples Audited: Retrospective audit of all laboratory submissions processed inside Cleanroom Suite 114 across the two-week window (03-Aug-2026 to 14-Aug-2026) identified 477 total samples.</w:t>
+        <w:t>• 477 Concurrent Samples Audited: Retrospective audit of all laboratory submissions processed inside Cleanroom Suite 114 across the two-week window (02-Aug-2026 to 15-Aug-2026) identified 477 total samples.</w:t>
       </w:r>
     </w:p>
     <w:p>
@@ -1826,7 +1826,7 @@
           <w:color w:val="2D3748"/>
           <w:sz w:val="18"/>
         </w:rPr>
-        <w:t>Based on the totality of evidence—including 474 passing concurrent samples (&gt;99.3% pass rate), uninterrupted 24/7 Lighthouse physical parameter stability, satisfactory session-specific ISO 5 BSC settling and contact plate monitoring, acceptable analyst glove touch plates, valid method negative controls, and clean post-reinstatement EM results—the microbiological integrity and physical containment of Cleanroom Suite 114 (114A/114B) remained in a validated state of control during 03-Aug-2026 through 14-Aug-2026. The missed weekly sampling represents an isolated documentation and scheduling oversight without evidence of environmental breakdown. The three (3) correlated sterility OOS investigations in Room 114B remain valid, and each report shall cross-reference NCR# N26436 and incorporate this risk evaluation to support Phase I closure.</w:t>
+        <w:t>Based on the totality of evidence—including 474 passing concurrent samples (&gt;99.3% pass rate), uninterrupted 24/7 Lighthouse physical parameter stability, satisfactory session-specific ISO 5 BSC settling and contact plate monitoring, acceptable analyst glove touch plates, valid method negative controls, and clean post-reinstatement EM results—the microbiological integrity and physical containment of Cleanroom Suite 114 (114A/114B) remained in a validated state of control during 02-Aug-2026 through 15-Aug-2026. The missed weekly sampling represents an isolated documentation and scheduling oversight without evidence of environmental breakdown. The three (3) correlated sterility OOS investigations in Room 114B remain valid, and each report shall cross-reference NCR# N26436 and incorporate this risk evaluation to support Phase I closure.</w:t>
       </w:r>
     </w:p>
     <w:p>

</xml_diff>